<commit_message>
added in references to unity asset store assets
</commit_message>
<xml_diff>
--- a/F122A12 - 2. Design and Build a Prototype Game.docx
+++ b/F122A12 - 2. Design and Build a Prototype Game.docx
@@ -385,6 +385,7 @@
             <w14:uncheckedState w14:val="2610" w14:font="MS Gothic"/>
           </w14:checkbox>
         </w:sdtPr>
+        <w:sdtEndPr/>
         <w:sdtContent>
           <w:r>
             <w:rPr>
@@ -423,6 +424,7 @@
             <w14:uncheckedState w14:val="2610" w14:font="MS Gothic"/>
           </w14:checkbox>
         </w:sdtPr>
+        <w:sdtEndPr/>
         <w:sdtContent>
           <w:r>
             <w:rPr>
@@ -461,6 +463,7 @@
             <w14:uncheckedState w14:val="2610" w14:font="MS Gothic"/>
           </w14:checkbox>
         </w:sdtPr>
+        <w:sdtEndPr/>
         <w:sdtContent>
           <w:r>
             <w:rPr>
@@ -510,6 +513,7 @@
             <w14:uncheckedState w14:val="2610" w14:font="MS Gothic"/>
           </w14:checkbox>
         </w:sdtPr>
+        <w:sdtEndPr/>
         <w:sdtContent>
           <w:r>
             <w:rPr>
@@ -1835,7 +1839,7 @@
                 <w:szCs w:val="22"/>
                 <w:lang w:val="en-US"/>
               </w:rPr>
-              <w:t>[Example]</w:t>
+              <w:t>Federation Corvette F3</w:t>
             </w:r>
           </w:p>
         </w:tc>
@@ -1852,14 +1856,16 @@
                 <w:lang w:val="en-US"/>
               </w:rPr>
             </w:pPr>
+            <w:proofErr w:type="spellStart"/>
             <w:r>
               <w:rPr>
                 <w:rFonts w:ascii="Calibri" w:eastAsia="Calibri" w:hAnsi="Calibri" w:cs="Times New Roman"/>
                 <w:szCs w:val="22"/>
                 <w:lang w:val="en-US"/>
               </w:rPr>
-              <w:t>[Vacant]</w:t>
+              <w:t>CGPitbull</w:t>
             </w:r>
+            <w:proofErr w:type="spellEnd"/>
           </w:p>
         </w:tc>
         <w:tc>
@@ -1881,7 +1887,7 @@
                 <w:szCs w:val="22"/>
                 <w:lang w:val="en-US"/>
               </w:rPr>
-              <w:t>[Unlicensed]</w:t>
+              <w:t>Standard Unity Asset Store EULA</w:t>
             </w:r>
           </w:p>
         </w:tc>
@@ -1898,14 +1904,16 @@
                 <w:lang w:val="en-US"/>
               </w:rPr>
             </w:pPr>
-            <w:r>
-              <w:rPr>
-                <w:rFonts w:ascii="Calibri" w:eastAsia="Calibri" w:hAnsi="Calibri" w:cs="Times New Roman"/>
-                <w:szCs w:val="22"/>
-                <w:lang w:val="en-US"/>
-              </w:rPr>
-              <w:t>[N/A]</w:t>
-            </w:r>
+            <w:hyperlink r:id="rId14" w:history="1">
+              <w:r>
+                <w:rPr>
+                  <w:rStyle w:val="Hyperlink"/>
+                  <w:rFonts w:ascii="Calibri" w:eastAsia="Calibri" w:hAnsi="Calibri" w:cs="Times New Roman"/>
+                  <w:szCs w:val="22"/>
+                </w:rPr>
+                <w:t>Federation Corvette F3 | 3D Space | Unity Asset Store</w:t>
+              </w:r>
+            </w:hyperlink>
           </w:p>
         </w:tc>
       </w:tr>
@@ -1923,6 +1931,14 @@
                 <w:lang w:val="en-US"/>
               </w:rPr>
             </w:pPr>
+            <w:r>
+              <w:rPr>
+                <w:rFonts w:ascii="Calibri" w:eastAsia="Calibri" w:hAnsi="Calibri" w:cs="Times New Roman"/>
+                <w:szCs w:val="22"/>
+                <w:lang w:val="en-US"/>
+              </w:rPr>
+              <w:t>Space Star Field Background</w:t>
+            </w:r>
           </w:p>
         </w:tc>
         <w:tc>
@@ -1938,6 +1954,14 @@
                 <w:lang w:val="en-US"/>
               </w:rPr>
             </w:pPr>
+            <w:r>
+              <w:rPr>
+                <w:rFonts w:ascii="Calibri" w:eastAsia="Calibri" w:hAnsi="Calibri" w:cs="Times New Roman"/>
+                <w:szCs w:val="22"/>
+                <w:lang w:val="en-US"/>
+              </w:rPr>
+              <w:t>Dilapidated Meow</w:t>
+            </w:r>
           </w:p>
         </w:tc>
         <w:tc>
@@ -1953,6 +1977,22 @@
                 <w:lang w:val="en-US"/>
               </w:rPr>
             </w:pPr>
+            <w:r>
+              <w:rPr>
+                <w:rFonts w:ascii="Calibri" w:eastAsia="Calibri" w:hAnsi="Calibri" w:cs="Times New Roman"/>
+                <w:szCs w:val="22"/>
+                <w:lang w:val="en-US"/>
+              </w:rPr>
+              <w:t xml:space="preserve">Standard Unity Asset Store </w:t>
+            </w:r>
+            <w:r>
+              <w:rPr>
+                <w:rFonts w:ascii="Calibri" w:eastAsia="Calibri" w:hAnsi="Calibri" w:cs="Times New Roman"/>
+                <w:szCs w:val="22"/>
+                <w:lang w:val="en-US"/>
+              </w:rPr>
+              <w:t>EULA</w:t>
+            </w:r>
           </w:p>
         </w:tc>
         <w:tc>
@@ -1968,6 +2008,234 @@
                 <w:lang w:val="en-US"/>
               </w:rPr>
             </w:pPr>
+            <w:hyperlink r:id="rId15" w:history="1">
+              <w:r>
+                <w:rPr>
+                  <w:rStyle w:val="Hyperlink"/>
+                  <w:rFonts w:ascii="Calibri" w:eastAsia="Calibri" w:hAnsi="Calibri" w:cs="Times New Roman"/>
+                  <w:szCs w:val="22"/>
+                </w:rPr>
+                <w:t>Space Star Field Backgrounds | 2D Textures &amp; Materials | Unity Asset Store</w:t>
+              </w:r>
+            </w:hyperlink>
+          </w:p>
+        </w:tc>
+      </w:tr>
+      <w:tr>
+        <w:tc>
+          <w:tcPr>
+            <w:tcW w:w="2274" w:type="dxa"/>
+          </w:tcPr>
+          <w:p>
+            <w:pPr>
+              <w:spacing w:line="240" w:lineRule="auto"/>
+              <w:rPr>
+                <w:rFonts w:ascii="Calibri" w:eastAsia="Calibri" w:hAnsi="Calibri" w:cs="Times New Roman"/>
+                <w:szCs w:val="22"/>
+                <w:lang w:val="en-US"/>
+              </w:rPr>
+            </w:pPr>
+            <w:r>
+              <w:rPr>
+                <w:rFonts w:ascii="Calibri" w:eastAsia="Calibri" w:hAnsi="Calibri" w:cs="Times New Roman"/>
+                <w:szCs w:val="22"/>
+                <w:lang w:val="en-US"/>
+              </w:rPr>
+              <w:t>Free Laser Weapons</w:t>
+            </w:r>
+          </w:p>
+        </w:tc>
+        <w:tc>
+          <w:tcPr>
+            <w:tcW w:w="2321" w:type="dxa"/>
+          </w:tcPr>
+          <w:p>
+            <w:pPr>
+              <w:spacing w:line="240" w:lineRule="auto"/>
+              <w:rPr>
+                <w:rFonts w:ascii="Calibri" w:eastAsia="Calibri" w:hAnsi="Calibri" w:cs="Times New Roman"/>
+                <w:szCs w:val="22"/>
+                <w:lang w:val="en-US"/>
+              </w:rPr>
+            </w:pPr>
+            <w:r>
+              <w:rPr>
+                <w:rFonts w:ascii="Calibri" w:eastAsia="Calibri" w:hAnsi="Calibri" w:cs="Times New Roman"/>
+                <w:szCs w:val="22"/>
+                <w:lang w:val="en-US"/>
+              </w:rPr>
+              <w:t xml:space="preserve">Daniel </w:t>
+            </w:r>
+            <w:proofErr w:type="spellStart"/>
+            <w:r>
+              <w:rPr>
+                <w:rFonts w:ascii="Calibri" w:eastAsia="Calibri" w:hAnsi="Calibri" w:cs="Times New Roman"/>
+                <w:szCs w:val="22"/>
+                <w:lang w:val="en-US"/>
+              </w:rPr>
+              <w:t>SoundsGood</w:t>
+            </w:r>
+            <w:proofErr w:type="spellEnd"/>
+          </w:p>
+        </w:tc>
+        <w:tc>
+          <w:tcPr>
+            <w:tcW w:w="2316" w:type="dxa"/>
+          </w:tcPr>
+          <w:p>
+            <w:pPr>
+              <w:spacing w:line="240" w:lineRule="auto"/>
+              <w:rPr>
+                <w:rFonts w:ascii="Calibri" w:eastAsia="Calibri" w:hAnsi="Calibri" w:cs="Times New Roman"/>
+                <w:szCs w:val="22"/>
+                <w:lang w:val="en-US"/>
+              </w:rPr>
+            </w:pPr>
+            <w:r>
+              <w:rPr>
+                <w:rFonts w:ascii="Calibri" w:eastAsia="Calibri" w:hAnsi="Calibri" w:cs="Times New Roman"/>
+                <w:szCs w:val="22"/>
+                <w:lang w:val="en-US"/>
+              </w:rPr>
+              <w:t>Standard Unity Asset Store</w:t>
+            </w:r>
+            <w:r>
+              <w:rPr>
+                <w:rFonts w:ascii="Calibri" w:eastAsia="Calibri" w:hAnsi="Calibri" w:cs="Times New Roman"/>
+                <w:szCs w:val="22"/>
+                <w:lang w:val="en-US"/>
+              </w:rPr>
+              <w:t xml:space="preserve"> EULA</w:t>
+            </w:r>
+          </w:p>
+        </w:tc>
+        <w:tc>
+          <w:tcPr>
+            <w:tcW w:w="2105" w:type="dxa"/>
+          </w:tcPr>
+          <w:p>
+            <w:pPr>
+              <w:spacing w:line="240" w:lineRule="auto"/>
+              <w:rPr>
+                <w:rFonts w:ascii="Calibri" w:eastAsia="Calibri" w:hAnsi="Calibri" w:cs="Times New Roman"/>
+                <w:szCs w:val="22"/>
+              </w:rPr>
+            </w:pPr>
+            <w:hyperlink r:id="rId16" w:history="1">
+              <w:r>
+                <w:rPr>
+                  <w:rStyle w:val="Hyperlink"/>
+                  <w:rFonts w:ascii="Calibri" w:eastAsia="Calibri" w:hAnsi="Calibri" w:cs="Times New Roman"/>
+                  <w:szCs w:val="22"/>
+                </w:rPr>
+                <w:t>Free Laser Weapons | Weapons Sound FX | Unity Asset Store</w:t>
+              </w:r>
+            </w:hyperlink>
+          </w:p>
+        </w:tc>
+      </w:tr>
+      <w:tr>
+        <w:tc>
+          <w:tcPr>
+            <w:tcW w:w="2274" w:type="dxa"/>
+          </w:tcPr>
+          <w:p>
+            <w:pPr>
+              <w:spacing w:line="240" w:lineRule="auto"/>
+              <w:rPr>
+                <w:rFonts w:ascii="Calibri" w:eastAsia="Calibri" w:hAnsi="Calibri" w:cs="Times New Roman"/>
+                <w:szCs w:val="22"/>
+                <w:lang w:val="en-US"/>
+              </w:rPr>
+            </w:pPr>
+            <w:r>
+              <w:rPr>
+                <w:rFonts w:ascii="Calibri" w:eastAsia="Calibri" w:hAnsi="Calibri" w:cs="Times New Roman"/>
+                <w:szCs w:val="22"/>
+                <w:lang w:val="en-US"/>
+              </w:rPr>
+              <w:t>World materials Free</w:t>
+            </w:r>
+          </w:p>
+        </w:tc>
+        <w:tc>
+          <w:tcPr>
+            <w:tcW w:w="2321" w:type="dxa"/>
+          </w:tcPr>
+          <w:p>
+            <w:pPr>
+              <w:spacing w:line="240" w:lineRule="auto"/>
+              <w:rPr>
+                <w:rFonts w:ascii="Calibri" w:eastAsia="Calibri" w:hAnsi="Calibri" w:cs="Times New Roman"/>
+                <w:szCs w:val="22"/>
+                <w:lang w:val="en-US"/>
+              </w:rPr>
+            </w:pPr>
+            <w:proofErr w:type="spellStart"/>
+            <w:r>
+              <w:rPr>
+                <w:rFonts w:ascii="Calibri" w:eastAsia="Calibri" w:hAnsi="Calibri" w:cs="Times New Roman"/>
+                <w:szCs w:val="22"/>
+                <w:lang w:val="en-US"/>
+              </w:rPr>
+              <w:t>Avionx</w:t>
+            </w:r>
+            <w:proofErr w:type="spellEnd"/>
+          </w:p>
+        </w:tc>
+        <w:tc>
+          <w:tcPr>
+            <w:tcW w:w="2316" w:type="dxa"/>
+          </w:tcPr>
+          <w:p>
+            <w:pPr>
+              <w:spacing w:line="240" w:lineRule="auto"/>
+              <w:rPr>
+                <w:rFonts w:ascii="Calibri" w:eastAsia="Calibri" w:hAnsi="Calibri" w:cs="Times New Roman"/>
+                <w:szCs w:val="22"/>
+                <w:lang w:val="en-US"/>
+              </w:rPr>
+            </w:pPr>
+            <w:r>
+              <w:rPr>
+                <w:rFonts w:ascii="Calibri" w:eastAsia="Calibri" w:hAnsi="Calibri" w:cs="Times New Roman"/>
+                <w:szCs w:val="22"/>
+                <w:lang w:val="en-US"/>
+              </w:rPr>
+              <w:t>Sta</w:t>
+            </w:r>
+            <w:r>
+              <w:rPr>
+                <w:rFonts w:ascii="Calibri" w:eastAsia="Calibri" w:hAnsi="Calibri" w:cs="Times New Roman"/>
+                <w:szCs w:val="22"/>
+                <w:lang w:val="en-US"/>
+              </w:rPr>
+              <w:t>ndard Unity Asset Store EULA</w:t>
+            </w:r>
+          </w:p>
+        </w:tc>
+        <w:tc>
+          <w:tcPr>
+            <w:tcW w:w="2105" w:type="dxa"/>
+          </w:tcPr>
+          <w:p>
+            <w:pPr>
+              <w:spacing w:line="240" w:lineRule="auto"/>
+              <w:rPr>
+                <w:rFonts w:ascii="Calibri" w:eastAsia="Calibri" w:hAnsi="Calibri" w:cs="Times New Roman"/>
+                <w:szCs w:val="22"/>
+              </w:rPr>
+            </w:pPr>
+            <w:hyperlink r:id="rId17" w:history="1">
+              <w:r>
+                <w:rPr>
+                  <w:rStyle w:val="Hyperlink"/>
+                  <w:rFonts w:ascii="Calibri" w:eastAsia="Calibri" w:hAnsi="Calibri" w:cs="Times New Roman"/>
+                  <w:szCs w:val="22"/>
+                </w:rPr>
+                <w:t>World Materials Free | 2D Textures &amp; Materials | Unity Asset Store</w:t>
+              </w:r>
+            </w:hyperlink>
           </w:p>
         </w:tc>
       </w:tr>
@@ -4525,8 +4793,8 @@
     <w:p/>
     <w:p/>
     <w:sectPr>
-      <w:headerReference w:type="default" r:id="rId14"/>
-      <w:footerReference w:type="default" r:id="rId15"/>
+      <w:headerReference w:type="default" r:id="rId18"/>
+      <w:footerReference w:type="default" r:id="rId19"/>
       <w:pgSz w:w="11906" w:h="16838" w:code="9"/>
       <w:pgMar w:top="851" w:right="851" w:bottom="851" w:left="851" w:header="567" w:footer="342" w:gutter="0"/>
       <w:cols w:space="720"/>
@@ -4758,6 +5026,7 @@
               <w:showingPlcHdr/>
               <w:text/>
             </w:sdtPr>
+            <w:sdtEndPr/>
             <w:sdtContent>
               <w:r>
                 <w:rPr>
@@ -6867,7 +7136,6 @@
   <w:style w:type="character" w:default="1" w:styleId="DefaultParagraphFont">
     <w:name w:val="Default Paragraph Font"/>
     <w:uiPriority w:val="1"/>
-    <w:semiHidden/>
     <w:unhideWhenUsed/>
   </w:style>
   <w:style w:type="table" w:default="1" w:styleId="TableNormal">
@@ -7299,6 +7567,28 @@
       </w:tblBorders>
     </w:tblPr>
   </w:style>
+  <w:style w:type="character" w:styleId="Hyperlink">
+    <w:name w:val="Hyperlink"/>
+    <w:basedOn w:val="DefaultParagraphFont"/>
+    <w:unhideWhenUsed/>
+    <w:rsid w:val="00A80863"/>
+    <w:rPr>
+      <w:color w:val="0000FF" w:themeColor="hyperlink"/>
+      <w:u w:val="single"/>
+    </w:rPr>
+  </w:style>
+  <w:style w:type="character" w:styleId="UnresolvedMention">
+    <w:name w:val="Unresolved Mention"/>
+    <w:basedOn w:val="DefaultParagraphFont"/>
+    <w:uiPriority w:val="99"/>
+    <w:semiHidden/>
+    <w:unhideWhenUsed/>
+    <w:rsid w:val="00A80863"/>
+    <w:rPr>
+      <w:color w:val="605E5C"/>
+      <w:shd w:val="clear" w:color="auto" w:fill="E1DFDD"/>
+    </w:rPr>
+  </w:style>
 </w:styles>
 </file>
 
@@ -7484,7 +7774,6 @@
     <w:rsid w:val="00825369"/>
     <w:rsid w:val="00831335"/>
     <w:rsid w:val="008700FC"/>
-    <w:rsid w:val="008B1A4D"/>
     <w:rsid w:val="009975A2"/>
     <w:rsid w:val="009D7603"/>
     <w:rsid w:val="00DF7BF4"/>

</xml_diff>